<commit_message>
Update folder Database - 34 bảng
</commit_message>
<xml_diff>
--- a/Database/Mota/Dac_Ta_CSDL_34_Bang_GiupeViec_v7_Updated.docx
+++ b/Database/Mota/Dac_Ta_CSDL_34_Bang_GiupeViec_v7_Updated.docx
@@ -5995,7 +5995,21 @@
                 <w:i/>
                 <w:iCs/>
               </w:rPr>
-              <w:t xml:space="preserve"> ghi lần trong này &amp;&amp; gói tháng</w:t>
+              <w:t xml:space="preserve"> ghi </w:t>
+            </w:r>
+            <w:r>
+              <w:rPr>
+                <w:i/>
+                <w:iCs/>
+              </w:rPr>
+              <w:t xml:space="preserve">1 </w:t>
+            </w:r>
+            <w:r>
+              <w:rPr>
+                <w:i/>
+                <w:iCs/>
+              </w:rPr>
+              <w:t>lần trong này &amp;&amp; gói tháng</w:t>
             </w:r>
             <w:r>
               <w:rPr>
@@ -6172,6 +6186,7 @@
           </w:tcPr>
           <w:p>
             <w:r>
+              <w:lastRenderedPageBreak/>
               <w:t>don_hang_id</w:t>
             </w:r>
           </w:p>
@@ -7218,6 +7233,7 @@
           </w:tcPr>
           <w:p>
             <w:r>
+              <w:lastRenderedPageBreak/>
               <w:t>vi_khach_hang_id</w:t>
             </w:r>
           </w:p>
@@ -8458,6 +8474,7 @@
         <w:pStyle w:val="Heading1"/>
       </w:pPr>
       <w:r>
+        <w:lastRenderedPageBreak/>
         <w:t>MODULE 5: HỆ THỐNG PHỤ (VOUCHER, ĐÁNH GIÁ, CHAT, KHIẾU NẠI)</w:t>
       </w:r>
     </w:p>
@@ -9627,6 +9644,7 @@
         <w:pStyle w:val="Heading2"/>
       </w:pPr>
       <w:r>
+        <w:lastRenderedPageBreak/>
         <w:t>📌 Bảng: KhuyenMai</w:t>
       </w:r>
     </w:p>
@@ -10871,6 +10889,7 @@
           </w:tcPr>
           <w:p>
             <w:r>
+              <w:lastRenderedPageBreak/>
               <w:t>so_tien_duoc_giam</w:t>
             </w:r>
           </w:p>
@@ -11985,6 +12004,7 @@
         <w:pStyle w:val="Heading1"/>
       </w:pPr>
       <w:r>
+        <w:lastRenderedPageBreak/>
         <w:t>TỔNG HỢP CÁC OPTION &amp; TRẠNG THÁI (ENUMERATIONS)</w:t>
       </w:r>
     </w:p>
@@ -12841,7 +12861,11 @@
               <w:cnfStyle w:val="000000100000" w:firstRow="0" w:lastRow="0" w:firstColumn="0" w:lastColumn="0" w:oddVBand="0" w:evenVBand="0" w:oddHBand="1" w:evenHBand="0" w:firstRowFirstColumn="0" w:firstRowLastColumn="0" w:lastRowFirstColumn="0" w:lastRowLastColumn="0"/>
             </w:pPr>
             <w:r>
-              <w:t>NhanLuong, RutTien, Phat, TruHoaHong, DonTienMat</w:t>
+              <w:t xml:space="preserve">NhanLuong, RutTien, Phat, TruHoaHong, </w:t>
+            </w:r>
+            <w:r>
+              <w:lastRenderedPageBreak/>
+              <w:t>DonTienMat</w:t>
             </w:r>
           </w:p>
         </w:tc>
@@ -12854,6 +12878,7 @@
               <w:cnfStyle w:val="000000100000" w:firstRow="0" w:lastRow="0" w:firstColumn="0" w:lastColumn="0" w:oddVBand="0" w:evenVBand="0" w:oddHBand="1" w:evenHBand="0" w:firstRowFirstColumn="0" w:firstRowLastColumn="0" w:lastRowFirstColumn="0" w:lastRowLastColumn="0"/>
             </w:pPr>
             <w:r>
+              <w:lastRenderedPageBreak/>
               <w:t>Lý do biến động ví nhân viên.</w:t>
             </w:r>
           </w:p>

</xml_diff>